<commit_message>
Documentacion - Todos los integrantes
</commit_message>
<xml_diff>
--- a/Alejandro/Casos de Uso Extendidos CU012 - CU017.docx
+++ b/Alejandro/Casos de Uso Extendidos CU012 - CU017.docx
@@ -1586,6 +1586,265 @@
           </w:p>
         </w:tc>
       </w:tr>
+      <w:tr>
+        <w:trPr>
+          <w:cantSplit w:val="0"/>
+          <w:tblHeader w:val="0"/>
+        </w:trPr>
+        <w:tc>
+          <w:tcPr>
+            <w:tcBorders>
+              <w:top w:color="000000" w:space="0" w:sz="4" w:val="single"/>
+              <w:left w:color="000000" w:space="0" w:sz="4" w:val="single"/>
+              <w:bottom w:color="000000" w:space="0" w:sz="4" w:val="single"/>
+              <w:right w:color="000000" w:space="0" w:sz="4" w:val="single"/>
+            </w:tcBorders>
+            <w:shd w:fill="1f497d" w:val="clear"/>
+            <w:tcMar>
+              <w:top w:w="80.0" w:type="dxa"/>
+              <w:left w:w="120.0" w:type="dxa"/>
+              <w:bottom w:w="80.0" w:type="dxa"/>
+              <w:right w:w="120.0" w:type="dxa"/>
+            </w:tcMar>
+          </w:tcPr>
+          <w:p>
+            <w:pPr>
+              <w:spacing w:after="0" w:lineRule="auto"/>
+              <w:rPr>
+                <w:rFonts w:ascii="Calibri" w:cs="Calibri" w:eastAsia="Calibri" w:hAnsi="Calibri"/>
+                <w:b w:val="1"/>
+                <w:bCs w:val="1"/>
+                <w:color w:val="ffffff"/>
+                <w:sz w:val="20"/>
+                <w:szCs w:val="20"/>
+              </w:rPr>
+            </w:pPr>
+            <w:r>
+              <w:rPr>
+                <w:rFonts w:ascii="Calibri" w:cs="Calibri" w:eastAsia="Calibri" w:hAnsi="Calibri"/>
+                <w:b w:val="1"/>
+                <w:bCs w:val="1"/>
+                <w:color w:val="ffffff"/>
+                <w:sz w:val="20"/>
+                <w:szCs w:val="20"/>
+                <w:rtl w:val="0"/>
+              </w:rPr>
+              <w:t xml:space="preserve">Trazabilidad</w:t>
+            </w:r>
+          </w:p>
+        </w:tc>
+        <w:tc>
+          <w:tcPr>
+            <w:tcBorders>
+              <w:top w:color="000000" w:space="0" w:sz="4" w:val="single"/>
+              <w:left w:color="000000" w:space="0" w:sz="4" w:val="single"/>
+              <w:bottom w:color="000000" w:space="0" w:sz="4" w:val="single"/>
+              <w:right w:color="000000" w:space="0" w:sz="4" w:val="single"/>
+            </w:tcBorders>
+            <w:tcMar>
+              <w:top w:w="80.0" w:type="dxa"/>
+              <w:left w:w="120.0" w:type="dxa"/>
+              <w:bottom w:w="80.0" w:type="dxa"/>
+              <w:right w:w="120.0" w:type="dxa"/>
+            </w:tcMar>
+          </w:tcPr>
+          <w:p>
+            <w:pPr>
+              <w:spacing w:after="240" w:before="240" w:lineRule="auto"/>
+              <w:rPr>
+                <w:rFonts w:ascii="Calibri" w:cs="Calibri" w:eastAsia="Calibri" w:hAnsi="Calibri"/>
+                <w:sz w:val="20"/>
+                <w:szCs w:val="20"/>
+              </w:rPr>
+            </w:pPr>
+            <w:r>
+              <w:rPr>
+                <w:rFonts w:ascii="Calibri" w:cs="Calibri" w:eastAsia="Calibri" w:hAnsi="Calibri"/>
+                <w:sz w:val="20"/>
+                <w:szCs w:val="20"/>
+                <w:rtl w:val="0"/>
+              </w:rPr>
+              <w:t xml:space="preserve">• </w:t>
+            </w:r>
+            <w:r>
+              <w:rPr>
+                <w:rFonts w:ascii="Calibri" w:cs="Calibri" w:eastAsia="Calibri" w:hAnsi="Calibri"/>
+                <w:b w:val="1"/>
+                <w:bCs w:val="1"/>
+                <w:sz w:val="20"/>
+                <w:szCs w:val="20"/>
+                <w:rtl w:val="0"/>
+              </w:rPr>
+              <w:t xml:space="preserve">Requerimiento Funcional:</w:t>
+            </w:r>
+            <w:r>
+              <w:rPr>
+                <w:rFonts w:ascii="Calibri" w:cs="Calibri" w:eastAsia="Calibri" w:hAnsi="Calibri"/>
+                <w:sz w:val="20"/>
+                <w:szCs w:val="20"/>
+                <w:rtl w:val="0"/>
+              </w:rPr>
+              <w:t xml:space="preserve"> RF012</w:t>
+            </w:r>
+          </w:p>
+          <w:p>
+            <w:pPr>
+              <w:spacing w:after="240" w:before="240" w:lineRule="auto"/>
+              <w:rPr>
+                <w:rFonts w:ascii="Calibri" w:cs="Calibri" w:eastAsia="Calibri" w:hAnsi="Calibri"/>
+                <w:sz w:val="20"/>
+                <w:szCs w:val="20"/>
+              </w:rPr>
+            </w:pPr>
+            <w:r>
+              <w:rPr>
+                <w:rFonts w:ascii="Calibri" w:cs="Calibri" w:eastAsia="Calibri" w:hAnsi="Calibri"/>
+                <w:sz w:val="20"/>
+                <w:szCs w:val="20"/>
+                <w:rtl w:val="0"/>
+              </w:rPr>
+              <w:t xml:space="preserve">• </w:t>
+            </w:r>
+            <w:r>
+              <w:rPr>
+                <w:rFonts w:ascii="Calibri" w:cs="Calibri" w:eastAsia="Calibri" w:hAnsi="Calibri"/>
+                <w:b w:val="1"/>
+                <w:bCs w:val="1"/>
+                <w:sz w:val="20"/>
+                <w:szCs w:val="20"/>
+                <w:rtl w:val="0"/>
+              </w:rPr>
+              <w:t xml:space="preserve">Historia de Usuario:</w:t>
+            </w:r>
+            <w:r>
+              <w:rPr>
+                <w:rFonts w:ascii="Calibri" w:cs="Calibri" w:eastAsia="Calibri" w:hAnsi="Calibri"/>
+                <w:sz w:val="20"/>
+                <w:szCs w:val="20"/>
+                <w:rtl w:val="0"/>
+              </w:rPr>
+              <w:t xml:space="preserve"> HU-012</w:t>
+            </w:r>
+          </w:p>
+          <w:p>
+            <w:pPr>
+              <w:spacing w:after="240" w:before="240" w:lineRule="auto"/>
+              <w:rPr>
+                <w:rFonts w:ascii="Calibri" w:cs="Calibri" w:eastAsia="Calibri" w:hAnsi="Calibri"/>
+                <w:sz w:val="20"/>
+                <w:szCs w:val="20"/>
+              </w:rPr>
+            </w:pPr>
+            <w:r>
+              <w:rPr>
+                <w:rFonts w:ascii="Calibri" w:cs="Calibri" w:eastAsia="Calibri" w:hAnsi="Calibri"/>
+                <w:sz w:val="20"/>
+                <w:szCs w:val="20"/>
+                <w:rtl w:val="0"/>
+              </w:rPr>
+              <w:t xml:space="preserve">• </w:t>
+            </w:r>
+            <w:r>
+              <w:rPr>
+                <w:rFonts w:ascii="Calibri" w:cs="Calibri" w:eastAsia="Calibri" w:hAnsi="Calibri"/>
+                <w:b w:val="1"/>
+                <w:bCs w:val="1"/>
+                <w:sz w:val="20"/>
+                <w:szCs w:val="20"/>
+                <w:rtl w:val="0"/>
+              </w:rPr>
+              <w:t xml:space="preserve">Épica:</w:t>
+            </w:r>
+            <w:r>
+              <w:rPr>
+                <w:rFonts w:ascii="Calibri" w:cs="Calibri" w:eastAsia="Calibri" w:hAnsi="Calibri"/>
+                <w:sz w:val="20"/>
+                <w:szCs w:val="20"/>
+                <w:rtl w:val="0"/>
+              </w:rPr>
+              <w:t xml:space="preserve"> EP-003 (Recomendaciones e IA)</w:t>
+            </w:r>
+          </w:p>
+          <w:p>
+            <w:pPr>
+              <w:spacing w:after="240" w:before="240" w:lineRule="auto"/>
+              <w:rPr>
+                <w:rFonts w:ascii="Calibri" w:cs="Calibri" w:eastAsia="Calibri" w:hAnsi="Calibri"/>
+                <w:sz w:val="20"/>
+                <w:szCs w:val="20"/>
+              </w:rPr>
+            </w:pPr>
+            <w:r>
+              <w:rPr>
+                <w:rFonts w:ascii="Calibri" w:cs="Calibri" w:eastAsia="Calibri" w:hAnsi="Calibri"/>
+                <w:sz w:val="20"/>
+                <w:szCs w:val="20"/>
+                <w:rtl w:val="0"/>
+              </w:rPr>
+              <w:t xml:space="preserve">• </w:t>
+            </w:r>
+            <w:r>
+              <w:rPr>
+                <w:rFonts w:ascii="Calibri" w:cs="Calibri" w:eastAsia="Calibri" w:hAnsi="Calibri"/>
+                <w:b w:val="1"/>
+                <w:bCs w:val="1"/>
+                <w:sz w:val="20"/>
+                <w:szCs w:val="20"/>
+                <w:rtl w:val="0"/>
+              </w:rPr>
+              <w:t xml:space="preserve">Módulo:</w:t>
+            </w:r>
+            <w:r>
+              <w:rPr>
+                <w:rFonts w:ascii="Calibri" w:cs="Calibri" w:eastAsia="Calibri" w:hAnsi="Calibri"/>
+                <w:sz w:val="20"/>
+                <w:szCs w:val="20"/>
+                <w:rtl w:val="0"/>
+              </w:rPr>
+              <w:t xml:space="preserve"> Motor de Recomendación IA</w:t>
+            </w:r>
+          </w:p>
+          <w:p>
+            <w:pPr>
+              <w:spacing w:after="240" w:before="240" w:lineRule="auto"/>
+              <w:rPr>
+                <w:rFonts w:ascii="Calibri" w:cs="Calibri" w:eastAsia="Calibri" w:hAnsi="Calibri"/>
+                <w:sz w:val="20"/>
+                <w:szCs w:val="20"/>
+              </w:rPr>
+            </w:pPr>
+            <w:r>
+              <w:rPr>
+                <w:rFonts w:ascii="Calibri" w:cs="Calibri" w:eastAsia="Calibri" w:hAnsi="Calibri"/>
+                <w:sz w:val="20"/>
+                <w:szCs w:val="20"/>
+                <w:rtl w:val="0"/>
+              </w:rPr>
+              <w:t xml:space="preserve">• </w:t>
+            </w:r>
+            <w:r>
+              <w:rPr>
+                <w:rFonts w:ascii="Calibri" w:cs="Calibri" w:eastAsia="Calibri" w:hAnsi="Calibri"/>
+                <w:b w:val="1"/>
+                <w:bCs w:val="1"/>
+                <w:sz w:val="20"/>
+                <w:szCs w:val="20"/>
+                <w:rtl w:val="0"/>
+              </w:rPr>
+              <w:t xml:space="preserve">Pruebas:</w:t>
+            </w:r>
+            <w:r>
+              <w:rPr>
+                <w:rFonts w:ascii="Calibri" w:cs="Calibri" w:eastAsia="Calibri" w:hAnsi="Calibri"/>
+                <w:sz w:val="20"/>
+                <w:szCs w:val="20"/>
+                <w:rtl w:val="0"/>
+              </w:rPr>
+              <w:t xml:space="preserve"> CP-RF012-01</w:t>
+            </w:r>
+          </w:p>
+        </w:tc>
+      </w:tr>
     </w:tbl>
     <w:p>
       <w:pPr>
@@ -2895,6 +3154,253 @@
               <w:rPr>
                 <w:rtl w:val="0"/>
               </w:rPr>
+            </w:r>
+          </w:p>
+        </w:tc>
+      </w:tr>
+      <w:tr>
+        <w:trPr>
+          <w:cantSplit w:val="0"/>
+          <w:tblHeader w:val="0"/>
+        </w:trPr>
+        <w:tc>
+          <w:tcPr>
+            <w:shd w:fill="1f497d" w:val="clear"/>
+            <w:tcMar>
+              <w:top w:w="80.0" w:type="dxa"/>
+              <w:left w:w="120.0" w:type="dxa"/>
+              <w:bottom w:w="80.0" w:type="dxa"/>
+              <w:right w:w="120.0" w:type="dxa"/>
+            </w:tcMar>
+          </w:tcPr>
+          <w:p>
+            <w:pPr>
+              <w:spacing w:after="0" w:lineRule="auto"/>
+              <w:rPr>
+                <w:rFonts w:ascii="Calibri" w:cs="Calibri" w:eastAsia="Calibri" w:hAnsi="Calibri"/>
+                <w:b w:val="1"/>
+                <w:bCs w:val="1"/>
+                <w:color w:val="ffffff"/>
+                <w:sz w:val="20"/>
+                <w:szCs w:val="20"/>
+              </w:rPr>
+            </w:pPr>
+            <w:r>
+              <w:rPr>
+                <w:rFonts w:ascii="Calibri" w:cs="Calibri" w:eastAsia="Calibri" w:hAnsi="Calibri"/>
+                <w:b w:val="1"/>
+                <w:bCs w:val="1"/>
+                <w:color w:val="ffffff"/>
+                <w:sz w:val="20"/>
+                <w:szCs w:val="20"/>
+                <w:rtl w:val="0"/>
+              </w:rPr>
+              <w:t xml:space="preserve">Trazabilidad</w:t>
+            </w:r>
+          </w:p>
+        </w:tc>
+        <w:tc>
+          <w:tcPr>
+            <w:tcMar>
+              <w:top w:w="80.0" w:type="dxa"/>
+              <w:left w:w="120.0" w:type="dxa"/>
+              <w:bottom w:w="80.0" w:type="dxa"/>
+              <w:right w:w="120.0" w:type="dxa"/>
+            </w:tcMar>
+          </w:tcPr>
+          <w:p>
+            <w:pPr>
+              <w:spacing w:after="240" w:before="240" w:lineRule="auto"/>
+              <w:rPr>
+                <w:rFonts w:ascii="Calibri" w:cs="Calibri" w:eastAsia="Calibri" w:hAnsi="Calibri"/>
+                <w:sz w:val="20"/>
+                <w:szCs w:val="20"/>
+              </w:rPr>
+            </w:pPr>
+            <w:r>
+              <w:rPr>
+                <w:rFonts w:ascii="Calibri" w:cs="Calibri" w:eastAsia="Calibri" w:hAnsi="Calibri"/>
+                <w:sz w:val="20"/>
+                <w:szCs w:val="20"/>
+                <w:rtl w:val="0"/>
+              </w:rPr>
+              <w:t xml:space="preserve">• </w:t>
+            </w:r>
+            <w:r>
+              <w:rPr>
+                <w:rFonts w:ascii="Calibri" w:cs="Calibri" w:eastAsia="Calibri" w:hAnsi="Calibri"/>
+                <w:b w:val="1"/>
+                <w:bCs w:val="1"/>
+                <w:sz w:val="20"/>
+                <w:szCs w:val="20"/>
+                <w:rtl w:val="0"/>
+              </w:rPr>
+              <w:t xml:space="preserve">Requerimiento Funcional:</w:t>
+            </w:r>
+            <w:r>
+              <w:rPr>
+                <w:rFonts w:ascii="Calibri" w:cs="Calibri" w:eastAsia="Calibri" w:hAnsi="Calibri"/>
+                <w:sz w:val="20"/>
+                <w:szCs w:val="20"/>
+                <w:rtl w:val="0"/>
+              </w:rPr>
+              <w:t xml:space="preserve"> RF013</w:t>
+            </w:r>
+          </w:p>
+          <w:p>
+            <w:pPr>
+              <w:spacing w:after="240" w:before="240" w:lineRule="auto"/>
+              <w:rPr>
+                <w:rFonts w:ascii="Calibri" w:cs="Calibri" w:eastAsia="Calibri" w:hAnsi="Calibri"/>
+                <w:sz w:val="20"/>
+                <w:szCs w:val="20"/>
+              </w:rPr>
+            </w:pPr>
+            <w:r>
+              <w:rPr>
+                <w:rFonts w:ascii="Calibri" w:cs="Calibri" w:eastAsia="Calibri" w:hAnsi="Calibri"/>
+                <w:sz w:val="20"/>
+                <w:szCs w:val="20"/>
+                <w:rtl w:val="0"/>
+              </w:rPr>
+              <w:t xml:space="preserve">• </w:t>
+            </w:r>
+            <w:r>
+              <w:rPr>
+                <w:rFonts w:ascii="Calibri" w:cs="Calibri" w:eastAsia="Calibri" w:hAnsi="Calibri"/>
+                <w:b w:val="1"/>
+                <w:bCs w:val="1"/>
+                <w:sz w:val="20"/>
+                <w:szCs w:val="20"/>
+                <w:rtl w:val="0"/>
+              </w:rPr>
+              <w:t xml:space="preserve">Historia de Usuario:</w:t>
+            </w:r>
+            <w:r>
+              <w:rPr>
+                <w:rFonts w:ascii="Calibri" w:cs="Calibri" w:eastAsia="Calibri" w:hAnsi="Calibri"/>
+                <w:sz w:val="20"/>
+                <w:szCs w:val="20"/>
+                <w:rtl w:val="0"/>
+              </w:rPr>
+              <w:t xml:space="preserve"> HU-013</w:t>
+            </w:r>
+          </w:p>
+          <w:p>
+            <w:pPr>
+              <w:spacing w:after="240" w:before="240" w:lineRule="auto"/>
+              <w:rPr>
+                <w:rFonts w:ascii="Calibri" w:cs="Calibri" w:eastAsia="Calibri" w:hAnsi="Calibri"/>
+                <w:sz w:val="20"/>
+                <w:szCs w:val="20"/>
+              </w:rPr>
+            </w:pPr>
+            <w:r>
+              <w:rPr>
+                <w:rFonts w:ascii="Calibri" w:cs="Calibri" w:eastAsia="Calibri" w:hAnsi="Calibri"/>
+                <w:sz w:val="20"/>
+                <w:szCs w:val="20"/>
+                <w:rtl w:val="0"/>
+              </w:rPr>
+              <w:t xml:space="preserve">• </w:t>
+            </w:r>
+            <w:r>
+              <w:rPr>
+                <w:rFonts w:ascii="Calibri" w:cs="Calibri" w:eastAsia="Calibri" w:hAnsi="Calibri"/>
+                <w:b w:val="1"/>
+                <w:bCs w:val="1"/>
+                <w:sz w:val="20"/>
+                <w:szCs w:val="20"/>
+                <w:rtl w:val="0"/>
+              </w:rPr>
+              <w:t xml:space="preserve">Épica:</w:t>
+            </w:r>
+            <w:r>
+              <w:rPr>
+                <w:rFonts w:ascii="Calibri" w:cs="Calibri" w:eastAsia="Calibri" w:hAnsi="Calibri"/>
+                <w:sz w:val="20"/>
+                <w:szCs w:val="20"/>
+                <w:rtl w:val="0"/>
+              </w:rPr>
+              <w:t xml:space="preserve"> EP-002 (Catálogo e Inventario)</w:t>
+            </w:r>
+          </w:p>
+          <w:p>
+            <w:pPr>
+              <w:spacing w:after="240" w:before="240" w:lineRule="auto"/>
+              <w:rPr>
+                <w:rFonts w:ascii="Calibri" w:cs="Calibri" w:eastAsia="Calibri" w:hAnsi="Calibri"/>
+                <w:sz w:val="20"/>
+                <w:szCs w:val="20"/>
+              </w:rPr>
+            </w:pPr>
+            <w:r>
+              <w:rPr>
+                <w:rFonts w:ascii="Calibri" w:cs="Calibri" w:eastAsia="Calibri" w:hAnsi="Calibri"/>
+                <w:sz w:val="20"/>
+                <w:szCs w:val="20"/>
+                <w:rtl w:val="0"/>
+              </w:rPr>
+              <w:t xml:space="preserve">• </w:t>
+            </w:r>
+            <w:r>
+              <w:rPr>
+                <w:rFonts w:ascii="Calibri" w:cs="Calibri" w:eastAsia="Calibri" w:hAnsi="Calibri"/>
+                <w:b w:val="1"/>
+                <w:bCs w:val="1"/>
+                <w:sz w:val="20"/>
+                <w:szCs w:val="20"/>
+                <w:rtl w:val="0"/>
+              </w:rPr>
+              <w:t xml:space="preserve">Módulo:</w:t>
+            </w:r>
+            <w:r>
+              <w:rPr>
+                <w:rFonts w:ascii="Calibri" w:cs="Calibri" w:eastAsia="Calibri" w:hAnsi="Calibri"/>
+                <w:sz w:val="20"/>
+                <w:szCs w:val="20"/>
+                <w:rtl w:val="0"/>
+              </w:rPr>
+              <w:t xml:space="preserve"> Catálogo Público</w:t>
+            </w:r>
+          </w:p>
+          <w:p>
+            <w:pPr>
+              <w:spacing w:after="240" w:before="240" w:lineRule="auto"/>
+              <w:rPr>
+                <w:rFonts w:ascii="Calibri" w:cs="Calibri" w:eastAsia="Calibri" w:hAnsi="Calibri"/>
+                <w:sz w:val="20"/>
+                <w:szCs w:val="20"/>
+              </w:rPr>
+            </w:pPr>
+            <w:r>
+              <w:rPr>
+                <w:rFonts w:ascii="Calibri" w:cs="Calibri" w:eastAsia="Calibri" w:hAnsi="Calibri"/>
+                <w:sz w:val="20"/>
+                <w:szCs w:val="20"/>
+                <w:rtl w:val="0"/>
+              </w:rPr>
+              <w:t xml:space="preserve">• </w:t>
+            </w:r>
+            <w:r>
+              <w:rPr>
+                <w:rFonts w:ascii="Calibri" w:cs="Calibri" w:eastAsia="Calibri" w:hAnsi="Calibri"/>
+                <w:b w:val="1"/>
+                <w:bCs w:val="1"/>
+                <w:sz w:val="20"/>
+                <w:szCs w:val="20"/>
+                <w:rtl w:val="0"/>
+              </w:rPr>
+              <w:t xml:space="preserve">Pruebas:</w:t>
+            </w:r>
+            <w:r>
+              <w:rPr>
+                <w:rFonts w:ascii="Calibri" w:cs="Calibri" w:eastAsia="Calibri" w:hAnsi="Calibri"/>
+                <w:sz w:val="20"/>
+                <w:szCs w:val="20"/>
+                <w:rtl w:val="0"/>
+              </w:rPr>
+              <w:t xml:space="preserve"> CP-RF013-01</w:t>
             </w:r>
           </w:p>
         </w:tc>
@@ -4192,6 +4698,253 @@
           </w:p>
         </w:tc>
       </w:tr>
+      <w:tr>
+        <w:trPr>
+          <w:cantSplit w:val="0"/>
+          <w:tblHeader w:val="0"/>
+        </w:trPr>
+        <w:tc>
+          <w:tcPr>
+            <w:shd w:fill="1f497d" w:val="clear"/>
+            <w:tcMar>
+              <w:top w:w="80.0" w:type="dxa"/>
+              <w:left w:w="120.0" w:type="dxa"/>
+              <w:bottom w:w="80.0" w:type="dxa"/>
+              <w:right w:w="120.0" w:type="dxa"/>
+            </w:tcMar>
+          </w:tcPr>
+          <w:p>
+            <w:pPr>
+              <w:spacing w:after="0" w:lineRule="auto"/>
+              <w:rPr>
+                <w:rFonts w:ascii="Calibri" w:cs="Calibri" w:eastAsia="Calibri" w:hAnsi="Calibri"/>
+                <w:b w:val="1"/>
+                <w:bCs w:val="1"/>
+                <w:color w:val="ffffff"/>
+                <w:sz w:val="20"/>
+                <w:szCs w:val="20"/>
+              </w:rPr>
+            </w:pPr>
+            <w:r>
+              <w:rPr>
+                <w:rFonts w:ascii="Calibri" w:cs="Calibri" w:eastAsia="Calibri" w:hAnsi="Calibri"/>
+                <w:b w:val="1"/>
+                <w:bCs w:val="1"/>
+                <w:color w:val="ffffff"/>
+                <w:sz w:val="20"/>
+                <w:szCs w:val="20"/>
+                <w:rtl w:val="0"/>
+              </w:rPr>
+              <w:t xml:space="preserve">Trazabilidad</w:t>
+            </w:r>
+          </w:p>
+        </w:tc>
+        <w:tc>
+          <w:tcPr>
+            <w:tcMar>
+              <w:top w:w="80.0" w:type="dxa"/>
+              <w:left w:w="120.0" w:type="dxa"/>
+              <w:bottom w:w="80.0" w:type="dxa"/>
+              <w:right w:w="120.0" w:type="dxa"/>
+            </w:tcMar>
+          </w:tcPr>
+          <w:p>
+            <w:pPr>
+              <w:spacing w:after="240" w:before="240" w:lineRule="auto"/>
+              <w:rPr>
+                <w:rFonts w:ascii="Calibri" w:cs="Calibri" w:eastAsia="Calibri" w:hAnsi="Calibri"/>
+                <w:sz w:val="20"/>
+                <w:szCs w:val="20"/>
+              </w:rPr>
+            </w:pPr>
+            <w:r>
+              <w:rPr>
+                <w:rFonts w:ascii="Calibri" w:cs="Calibri" w:eastAsia="Calibri" w:hAnsi="Calibri"/>
+                <w:sz w:val="20"/>
+                <w:szCs w:val="20"/>
+                <w:rtl w:val="0"/>
+              </w:rPr>
+              <w:t xml:space="preserve">• </w:t>
+            </w:r>
+            <w:r>
+              <w:rPr>
+                <w:rFonts w:ascii="Calibri" w:cs="Calibri" w:eastAsia="Calibri" w:hAnsi="Calibri"/>
+                <w:b w:val="1"/>
+                <w:bCs w:val="1"/>
+                <w:sz w:val="20"/>
+                <w:szCs w:val="20"/>
+                <w:rtl w:val="0"/>
+              </w:rPr>
+              <w:t xml:space="preserve">Requerimiento Funcional:</w:t>
+            </w:r>
+            <w:r>
+              <w:rPr>
+                <w:rFonts w:ascii="Calibri" w:cs="Calibri" w:eastAsia="Calibri" w:hAnsi="Calibri"/>
+                <w:sz w:val="20"/>
+                <w:szCs w:val="20"/>
+                <w:rtl w:val="0"/>
+              </w:rPr>
+              <w:t xml:space="preserve"> RF014</w:t>
+            </w:r>
+          </w:p>
+          <w:p>
+            <w:pPr>
+              <w:spacing w:after="240" w:before="240" w:lineRule="auto"/>
+              <w:rPr>
+                <w:rFonts w:ascii="Calibri" w:cs="Calibri" w:eastAsia="Calibri" w:hAnsi="Calibri"/>
+                <w:sz w:val="20"/>
+                <w:szCs w:val="20"/>
+              </w:rPr>
+            </w:pPr>
+            <w:r>
+              <w:rPr>
+                <w:rFonts w:ascii="Calibri" w:cs="Calibri" w:eastAsia="Calibri" w:hAnsi="Calibri"/>
+                <w:sz w:val="20"/>
+                <w:szCs w:val="20"/>
+                <w:rtl w:val="0"/>
+              </w:rPr>
+              <w:t xml:space="preserve">• </w:t>
+            </w:r>
+            <w:r>
+              <w:rPr>
+                <w:rFonts w:ascii="Calibri" w:cs="Calibri" w:eastAsia="Calibri" w:hAnsi="Calibri"/>
+                <w:b w:val="1"/>
+                <w:bCs w:val="1"/>
+                <w:sz w:val="20"/>
+                <w:szCs w:val="20"/>
+                <w:rtl w:val="0"/>
+              </w:rPr>
+              <w:t xml:space="preserve">Historia de Usuario:</w:t>
+            </w:r>
+            <w:r>
+              <w:rPr>
+                <w:rFonts w:ascii="Calibri" w:cs="Calibri" w:eastAsia="Calibri" w:hAnsi="Calibri"/>
+                <w:sz w:val="20"/>
+                <w:szCs w:val="20"/>
+                <w:rtl w:val="0"/>
+              </w:rPr>
+              <w:t xml:space="preserve"> HU-014</w:t>
+            </w:r>
+          </w:p>
+          <w:p>
+            <w:pPr>
+              <w:spacing w:after="240" w:before="240" w:lineRule="auto"/>
+              <w:rPr>
+                <w:rFonts w:ascii="Calibri" w:cs="Calibri" w:eastAsia="Calibri" w:hAnsi="Calibri"/>
+                <w:sz w:val="20"/>
+                <w:szCs w:val="20"/>
+              </w:rPr>
+            </w:pPr>
+            <w:r>
+              <w:rPr>
+                <w:rFonts w:ascii="Calibri" w:cs="Calibri" w:eastAsia="Calibri" w:hAnsi="Calibri"/>
+                <w:sz w:val="20"/>
+                <w:szCs w:val="20"/>
+                <w:rtl w:val="0"/>
+              </w:rPr>
+              <w:t xml:space="preserve">• </w:t>
+            </w:r>
+            <w:r>
+              <w:rPr>
+                <w:rFonts w:ascii="Calibri" w:cs="Calibri" w:eastAsia="Calibri" w:hAnsi="Calibri"/>
+                <w:b w:val="1"/>
+                <w:bCs w:val="1"/>
+                <w:sz w:val="20"/>
+                <w:szCs w:val="20"/>
+                <w:rtl w:val="0"/>
+              </w:rPr>
+              <w:t xml:space="preserve">Épica:</w:t>
+            </w:r>
+            <w:r>
+              <w:rPr>
+                <w:rFonts w:ascii="Calibri" w:cs="Calibri" w:eastAsia="Calibri" w:hAnsi="Calibri"/>
+                <w:sz w:val="20"/>
+                <w:szCs w:val="20"/>
+                <w:rtl w:val="0"/>
+              </w:rPr>
+              <w:t xml:space="preserve"> EP-002 (Catálogo e Inventario)</w:t>
+            </w:r>
+          </w:p>
+          <w:p>
+            <w:pPr>
+              <w:spacing w:after="240" w:before="240" w:lineRule="auto"/>
+              <w:rPr>
+                <w:rFonts w:ascii="Calibri" w:cs="Calibri" w:eastAsia="Calibri" w:hAnsi="Calibri"/>
+                <w:sz w:val="20"/>
+                <w:szCs w:val="20"/>
+              </w:rPr>
+            </w:pPr>
+            <w:r>
+              <w:rPr>
+                <w:rFonts w:ascii="Calibri" w:cs="Calibri" w:eastAsia="Calibri" w:hAnsi="Calibri"/>
+                <w:sz w:val="20"/>
+                <w:szCs w:val="20"/>
+                <w:rtl w:val="0"/>
+              </w:rPr>
+              <w:t xml:space="preserve">• </w:t>
+            </w:r>
+            <w:r>
+              <w:rPr>
+                <w:rFonts w:ascii="Calibri" w:cs="Calibri" w:eastAsia="Calibri" w:hAnsi="Calibri"/>
+                <w:b w:val="1"/>
+                <w:bCs w:val="1"/>
+                <w:sz w:val="20"/>
+                <w:szCs w:val="20"/>
+                <w:rtl w:val="0"/>
+              </w:rPr>
+              <w:t xml:space="preserve">Módulo:</w:t>
+            </w:r>
+            <w:r>
+              <w:rPr>
+                <w:rFonts w:ascii="Calibri" w:cs="Calibri" w:eastAsia="Calibri" w:hAnsi="Calibri"/>
+                <w:sz w:val="20"/>
+                <w:szCs w:val="20"/>
+                <w:rtl w:val="0"/>
+              </w:rPr>
+              <w:t xml:space="preserve"> Detalle de Productos</w:t>
+            </w:r>
+          </w:p>
+          <w:p>
+            <w:pPr>
+              <w:spacing w:after="240" w:before="240" w:lineRule="auto"/>
+              <w:rPr>
+                <w:rFonts w:ascii="Calibri" w:cs="Calibri" w:eastAsia="Calibri" w:hAnsi="Calibri"/>
+                <w:sz w:val="20"/>
+                <w:szCs w:val="20"/>
+              </w:rPr>
+            </w:pPr>
+            <w:r>
+              <w:rPr>
+                <w:rFonts w:ascii="Calibri" w:cs="Calibri" w:eastAsia="Calibri" w:hAnsi="Calibri"/>
+                <w:sz w:val="20"/>
+                <w:szCs w:val="20"/>
+                <w:rtl w:val="0"/>
+              </w:rPr>
+              <w:t xml:space="preserve">• </w:t>
+            </w:r>
+            <w:r>
+              <w:rPr>
+                <w:rFonts w:ascii="Calibri" w:cs="Calibri" w:eastAsia="Calibri" w:hAnsi="Calibri"/>
+                <w:b w:val="1"/>
+                <w:bCs w:val="1"/>
+                <w:sz w:val="20"/>
+                <w:szCs w:val="20"/>
+                <w:rtl w:val="0"/>
+              </w:rPr>
+              <w:t xml:space="preserve">Pruebas:</w:t>
+            </w:r>
+            <w:r>
+              <w:rPr>
+                <w:rFonts w:ascii="Calibri" w:cs="Calibri" w:eastAsia="Calibri" w:hAnsi="Calibri"/>
+                <w:sz w:val="20"/>
+                <w:szCs w:val="20"/>
+                <w:rtl w:val="0"/>
+              </w:rPr>
+              <w:t xml:space="preserve"> CP-RF014-01</w:t>
+            </w:r>
+          </w:p>
+        </w:tc>
+      </w:tr>
     </w:tbl>
     <w:p>
       <w:pPr>
@@ -5765,6 +6518,253 @@
               <w:rPr>
                 <w:rtl w:val="0"/>
               </w:rPr>
+            </w:r>
+          </w:p>
+        </w:tc>
+      </w:tr>
+      <w:tr>
+        <w:trPr>
+          <w:cantSplit w:val="0"/>
+          <w:tblHeader w:val="0"/>
+        </w:trPr>
+        <w:tc>
+          <w:tcPr>
+            <w:shd w:fill="1f497d" w:val="clear"/>
+            <w:tcMar>
+              <w:top w:w="80.0" w:type="dxa"/>
+              <w:left w:w="120.0" w:type="dxa"/>
+              <w:bottom w:w="80.0" w:type="dxa"/>
+              <w:right w:w="120.0" w:type="dxa"/>
+            </w:tcMar>
+          </w:tcPr>
+          <w:p>
+            <w:pPr>
+              <w:spacing w:after="0" w:lineRule="auto"/>
+              <w:rPr>
+                <w:rFonts w:ascii="Calibri" w:cs="Calibri" w:eastAsia="Calibri" w:hAnsi="Calibri"/>
+                <w:b w:val="1"/>
+                <w:bCs w:val="1"/>
+                <w:color w:val="ffffff"/>
+                <w:sz w:val="20"/>
+                <w:szCs w:val="20"/>
+              </w:rPr>
+            </w:pPr>
+            <w:r>
+              <w:rPr>
+                <w:rFonts w:ascii="Calibri" w:cs="Calibri" w:eastAsia="Calibri" w:hAnsi="Calibri"/>
+                <w:b w:val="1"/>
+                <w:bCs w:val="1"/>
+                <w:color w:val="ffffff"/>
+                <w:sz w:val="20"/>
+                <w:szCs w:val="20"/>
+                <w:rtl w:val="0"/>
+              </w:rPr>
+              <w:t xml:space="preserve">Trazabilidad</w:t>
+            </w:r>
+          </w:p>
+        </w:tc>
+        <w:tc>
+          <w:tcPr>
+            <w:tcMar>
+              <w:top w:w="80.0" w:type="dxa"/>
+              <w:left w:w="120.0" w:type="dxa"/>
+              <w:bottom w:w="80.0" w:type="dxa"/>
+              <w:right w:w="120.0" w:type="dxa"/>
+            </w:tcMar>
+          </w:tcPr>
+          <w:p>
+            <w:pPr>
+              <w:spacing w:after="240" w:before="240" w:lineRule="auto"/>
+              <w:rPr>
+                <w:rFonts w:ascii="Calibri" w:cs="Calibri" w:eastAsia="Calibri" w:hAnsi="Calibri"/>
+                <w:sz w:val="20"/>
+                <w:szCs w:val="20"/>
+              </w:rPr>
+            </w:pPr>
+            <w:r>
+              <w:rPr>
+                <w:rFonts w:ascii="Calibri" w:cs="Calibri" w:eastAsia="Calibri" w:hAnsi="Calibri"/>
+                <w:sz w:val="20"/>
+                <w:szCs w:val="20"/>
+                <w:rtl w:val="0"/>
+              </w:rPr>
+              <w:t xml:space="preserve">• </w:t>
+            </w:r>
+            <w:r>
+              <w:rPr>
+                <w:rFonts w:ascii="Calibri" w:cs="Calibri" w:eastAsia="Calibri" w:hAnsi="Calibri"/>
+                <w:b w:val="1"/>
+                <w:bCs w:val="1"/>
+                <w:sz w:val="20"/>
+                <w:szCs w:val="20"/>
+                <w:rtl w:val="0"/>
+              </w:rPr>
+              <w:t xml:space="preserve">Requerimiento Funcional:</w:t>
+            </w:r>
+            <w:r>
+              <w:rPr>
+                <w:rFonts w:ascii="Calibri" w:cs="Calibri" w:eastAsia="Calibri" w:hAnsi="Calibri"/>
+                <w:sz w:val="20"/>
+                <w:szCs w:val="20"/>
+                <w:rtl w:val="0"/>
+              </w:rPr>
+              <w:t xml:space="preserve"> RF015</w:t>
+            </w:r>
+          </w:p>
+          <w:p>
+            <w:pPr>
+              <w:spacing w:after="240" w:before="240" w:lineRule="auto"/>
+              <w:rPr>
+                <w:rFonts w:ascii="Calibri" w:cs="Calibri" w:eastAsia="Calibri" w:hAnsi="Calibri"/>
+                <w:sz w:val="20"/>
+                <w:szCs w:val="20"/>
+              </w:rPr>
+            </w:pPr>
+            <w:r>
+              <w:rPr>
+                <w:rFonts w:ascii="Calibri" w:cs="Calibri" w:eastAsia="Calibri" w:hAnsi="Calibri"/>
+                <w:sz w:val="20"/>
+                <w:szCs w:val="20"/>
+                <w:rtl w:val="0"/>
+              </w:rPr>
+              <w:t xml:space="preserve">• </w:t>
+            </w:r>
+            <w:r>
+              <w:rPr>
+                <w:rFonts w:ascii="Calibri" w:cs="Calibri" w:eastAsia="Calibri" w:hAnsi="Calibri"/>
+                <w:b w:val="1"/>
+                <w:bCs w:val="1"/>
+                <w:sz w:val="20"/>
+                <w:szCs w:val="20"/>
+                <w:rtl w:val="0"/>
+              </w:rPr>
+              <w:t xml:space="preserve">Historia de Usuario:</w:t>
+            </w:r>
+            <w:r>
+              <w:rPr>
+                <w:rFonts w:ascii="Calibri" w:cs="Calibri" w:eastAsia="Calibri" w:hAnsi="Calibri"/>
+                <w:sz w:val="20"/>
+                <w:szCs w:val="20"/>
+                <w:rtl w:val="0"/>
+              </w:rPr>
+              <w:t xml:space="preserve"> HU-015</w:t>
+            </w:r>
+          </w:p>
+          <w:p>
+            <w:pPr>
+              <w:spacing w:after="240" w:before="240" w:lineRule="auto"/>
+              <w:rPr>
+                <w:rFonts w:ascii="Calibri" w:cs="Calibri" w:eastAsia="Calibri" w:hAnsi="Calibri"/>
+                <w:sz w:val="20"/>
+                <w:szCs w:val="20"/>
+              </w:rPr>
+            </w:pPr>
+            <w:r>
+              <w:rPr>
+                <w:rFonts w:ascii="Calibri" w:cs="Calibri" w:eastAsia="Calibri" w:hAnsi="Calibri"/>
+                <w:sz w:val="20"/>
+                <w:szCs w:val="20"/>
+                <w:rtl w:val="0"/>
+              </w:rPr>
+              <w:t xml:space="preserve">• </w:t>
+            </w:r>
+            <w:r>
+              <w:rPr>
+                <w:rFonts w:ascii="Calibri" w:cs="Calibri" w:eastAsia="Calibri" w:hAnsi="Calibri"/>
+                <w:b w:val="1"/>
+                <w:bCs w:val="1"/>
+                <w:sz w:val="20"/>
+                <w:szCs w:val="20"/>
+                <w:rtl w:val="0"/>
+              </w:rPr>
+              <w:t xml:space="preserve">Épica:</w:t>
+            </w:r>
+            <w:r>
+              <w:rPr>
+                <w:rFonts w:ascii="Calibri" w:cs="Calibri" w:eastAsia="Calibri" w:hAnsi="Calibri"/>
+                <w:sz w:val="20"/>
+                <w:szCs w:val="20"/>
+                <w:rtl w:val="0"/>
+              </w:rPr>
+              <w:t xml:space="preserve"> EP-004 (Ventas y Cotizaciones)</w:t>
+            </w:r>
+          </w:p>
+          <w:p>
+            <w:pPr>
+              <w:spacing w:after="240" w:before="240" w:lineRule="auto"/>
+              <w:rPr>
+                <w:rFonts w:ascii="Calibri" w:cs="Calibri" w:eastAsia="Calibri" w:hAnsi="Calibri"/>
+                <w:sz w:val="20"/>
+                <w:szCs w:val="20"/>
+              </w:rPr>
+            </w:pPr>
+            <w:r>
+              <w:rPr>
+                <w:rFonts w:ascii="Calibri" w:cs="Calibri" w:eastAsia="Calibri" w:hAnsi="Calibri"/>
+                <w:sz w:val="20"/>
+                <w:szCs w:val="20"/>
+                <w:rtl w:val="0"/>
+              </w:rPr>
+              <w:t xml:space="preserve">• </w:t>
+            </w:r>
+            <w:r>
+              <w:rPr>
+                <w:rFonts w:ascii="Calibri" w:cs="Calibri" w:eastAsia="Calibri" w:hAnsi="Calibri"/>
+                <w:b w:val="1"/>
+                <w:bCs w:val="1"/>
+                <w:sz w:val="20"/>
+                <w:szCs w:val="20"/>
+                <w:rtl w:val="0"/>
+              </w:rPr>
+              <w:t xml:space="preserve">Módulo:</w:t>
+            </w:r>
+            <w:r>
+              <w:rPr>
+                <w:rFonts w:ascii="Calibri" w:cs="Calibri" w:eastAsia="Calibri" w:hAnsi="Calibri"/>
+                <w:sz w:val="20"/>
+                <w:szCs w:val="20"/>
+                <w:rtl w:val="0"/>
+              </w:rPr>
+              <w:t xml:space="preserve"> Gestión de Cotizaciones</w:t>
+            </w:r>
+          </w:p>
+          <w:p>
+            <w:pPr>
+              <w:spacing w:after="240" w:before="240" w:lineRule="auto"/>
+              <w:rPr>
+                <w:rFonts w:ascii="Calibri" w:cs="Calibri" w:eastAsia="Calibri" w:hAnsi="Calibri"/>
+                <w:sz w:val="20"/>
+                <w:szCs w:val="20"/>
+              </w:rPr>
+            </w:pPr>
+            <w:r>
+              <w:rPr>
+                <w:rFonts w:ascii="Calibri" w:cs="Calibri" w:eastAsia="Calibri" w:hAnsi="Calibri"/>
+                <w:sz w:val="20"/>
+                <w:szCs w:val="20"/>
+                <w:rtl w:val="0"/>
+              </w:rPr>
+              <w:t xml:space="preserve">• </w:t>
+            </w:r>
+            <w:r>
+              <w:rPr>
+                <w:rFonts w:ascii="Calibri" w:cs="Calibri" w:eastAsia="Calibri" w:hAnsi="Calibri"/>
+                <w:b w:val="1"/>
+                <w:bCs w:val="1"/>
+                <w:sz w:val="20"/>
+                <w:szCs w:val="20"/>
+                <w:rtl w:val="0"/>
+              </w:rPr>
+              <w:t xml:space="preserve">Pruebas:</w:t>
+            </w:r>
+            <w:r>
+              <w:rPr>
+                <w:rFonts w:ascii="Calibri" w:cs="Calibri" w:eastAsia="Calibri" w:hAnsi="Calibri"/>
+                <w:sz w:val="20"/>
+                <w:szCs w:val="20"/>
+                <w:rtl w:val="0"/>
+              </w:rPr>
+              <w:t xml:space="preserve"> CP-RF015-01</w:t>
             </w:r>
           </w:p>
         </w:tc>
@@ -7102,6 +8102,253 @@
           </w:p>
         </w:tc>
       </w:tr>
+      <w:tr>
+        <w:trPr>
+          <w:cantSplit w:val="0"/>
+          <w:tblHeader w:val="0"/>
+        </w:trPr>
+        <w:tc>
+          <w:tcPr>
+            <w:shd w:fill="1f497d" w:val="clear"/>
+            <w:tcMar>
+              <w:top w:w="80.0" w:type="dxa"/>
+              <w:left w:w="120.0" w:type="dxa"/>
+              <w:bottom w:w="80.0" w:type="dxa"/>
+              <w:right w:w="120.0" w:type="dxa"/>
+            </w:tcMar>
+          </w:tcPr>
+          <w:p>
+            <w:pPr>
+              <w:spacing w:after="0" w:lineRule="auto"/>
+              <w:rPr>
+                <w:rFonts w:ascii="Calibri" w:cs="Calibri" w:eastAsia="Calibri" w:hAnsi="Calibri"/>
+                <w:b w:val="1"/>
+                <w:bCs w:val="1"/>
+                <w:color w:val="ffffff"/>
+                <w:sz w:val="20"/>
+                <w:szCs w:val="20"/>
+              </w:rPr>
+            </w:pPr>
+            <w:r>
+              <w:rPr>
+                <w:rFonts w:ascii="Calibri" w:cs="Calibri" w:eastAsia="Calibri" w:hAnsi="Calibri"/>
+                <w:b w:val="1"/>
+                <w:bCs w:val="1"/>
+                <w:color w:val="ffffff"/>
+                <w:sz w:val="20"/>
+                <w:szCs w:val="20"/>
+                <w:rtl w:val="0"/>
+              </w:rPr>
+              <w:t xml:space="preserve">Trazabilidad</w:t>
+            </w:r>
+          </w:p>
+        </w:tc>
+        <w:tc>
+          <w:tcPr>
+            <w:tcMar>
+              <w:top w:w="80.0" w:type="dxa"/>
+              <w:left w:w="120.0" w:type="dxa"/>
+              <w:bottom w:w="80.0" w:type="dxa"/>
+              <w:right w:w="120.0" w:type="dxa"/>
+            </w:tcMar>
+          </w:tcPr>
+          <w:p>
+            <w:pPr>
+              <w:spacing w:after="240" w:before="240" w:lineRule="auto"/>
+              <w:rPr>
+                <w:rFonts w:ascii="Calibri" w:cs="Calibri" w:eastAsia="Calibri" w:hAnsi="Calibri"/>
+                <w:sz w:val="20"/>
+                <w:szCs w:val="20"/>
+              </w:rPr>
+            </w:pPr>
+            <w:r>
+              <w:rPr>
+                <w:rFonts w:ascii="Calibri" w:cs="Calibri" w:eastAsia="Calibri" w:hAnsi="Calibri"/>
+                <w:sz w:val="20"/>
+                <w:szCs w:val="20"/>
+                <w:rtl w:val="0"/>
+              </w:rPr>
+              <w:t xml:space="preserve">• </w:t>
+            </w:r>
+            <w:r>
+              <w:rPr>
+                <w:rFonts w:ascii="Calibri" w:cs="Calibri" w:eastAsia="Calibri" w:hAnsi="Calibri"/>
+                <w:b w:val="1"/>
+                <w:bCs w:val="1"/>
+                <w:sz w:val="20"/>
+                <w:szCs w:val="20"/>
+                <w:rtl w:val="0"/>
+              </w:rPr>
+              <w:t xml:space="preserve">Requerimiento Funcional:</w:t>
+            </w:r>
+            <w:r>
+              <w:rPr>
+                <w:rFonts w:ascii="Calibri" w:cs="Calibri" w:eastAsia="Calibri" w:hAnsi="Calibri"/>
+                <w:sz w:val="20"/>
+                <w:szCs w:val="20"/>
+                <w:rtl w:val="0"/>
+              </w:rPr>
+              <w:t xml:space="preserve"> RF016</w:t>
+            </w:r>
+          </w:p>
+          <w:p>
+            <w:pPr>
+              <w:spacing w:after="240" w:before="240" w:lineRule="auto"/>
+              <w:rPr>
+                <w:rFonts w:ascii="Calibri" w:cs="Calibri" w:eastAsia="Calibri" w:hAnsi="Calibri"/>
+                <w:sz w:val="20"/>
+                <w:szCs w:val="20"/>
+              </w:rPr>
+            </w:pPr>
+            <w:r>
+              <w:rPr>
+                <w:rFonts w:ascii="Calibri" w:cs="Calibri" w:eastAsia="Calibri" w:hAnsi="Calibri"/>
+                <w:sz w:val="20"/>
+                <w:szCs w:val="20"/>
+                <w:rtl w:val="0"/>
+              </w:rPr>
+              <w:t xml:space="preserve">• </w:t>
+            </w:r>
+            <w:r>
+              <w:rPr>
+                <w:rFonts w:ascii="Calibri" w:cs="Calibri" w:eastAsia="Calibri" w:hAnsi="Calibri"/>
+                <w:b w:val="1"/>
+                <w:bCs w:val="1"/>
+                <w:sz w:val="20"/>
+                <w:szCs w:val="20"/>
+                <w:rtl w:val="0"/>
+              </w:rPr>
+              <w:t xml:space="preserve">Historia de Usuario:</w:t>
+            </w:r>
+            <w:r>
+              <w:rPr>
+                <w:rFonts w:ascii="Calibri" w:cs="Calibri" w:eastAsia="Calibri" w:hAnsi="Calibri"/>
+                <w:sz w:val="20"/>
+                <w:szCs w:val="20"/>
+                <w:rtl w:val="0"/>
+              </w:rPr>
+              <w:t xml:space="preserve"> HU-016</w:t>
+            </w:r>
+          </w:p>
+          <w:p>
+            <w:pPr>
+              <w:spacing w:after="240" w:before="240" w:lineRule="auto"/>
+              <w:rPr>
+                <w:rFonts w:ascii="Calibri" w:cs="Calibri" w:eastAsia="Calibri" w:hAnsi="Calibri"/>
+                <w:sz w:val="20"/>
+                <w:szCs w:val="20"/>
+              </w:rPr>
+            </w:pPr>
+            <w:r>
+              <w:rPr>
+                <w:rFonts w:ascii="Calibri" w:cs="Calibri" w:eastAsia="Calibri" w:hAnsi="Calibri"/>
+                <w:sz w:val="20"/>
+                <w:szCs w:val="20"/>
+                <w:rtl w:val="0"/>
+              </w:rPr>
+              <w:t xml:space="preserve">• </w:t>
+            </w:r>
+            <w:r>
+              <w:rPr>
+                <w:rFonts w:ascii="Calibri" w:cs="Calibri" w:eastAsia="Calibri" w:hAnsi="Calibri"/>
+                <w:b w:val="1"/>
+                <w:bCs w:val="1"/>
+                <w:sz w:val="20"/>
+                <w:szCs w:val="20"/>
+                <w:rtl w:val="0"/>
+              </w:rPr>
+              <w:t xml:space="preserve">Épica:</w:t>
+            </w:r>
+            <w:r>
+              <w:rPr>
+                <w:rFonts w:ascii="Calibri" w:cs="Calibri" w:eastAsia="Calibri" w:hAnsi="Calibri"/>
+                <w:sz w:val="20"/>
+                <w:szCs w:val="20"/>
+                <w:rtl w:val="0"/>
+              </w:rPr>
+              <w:t xml:space="preserve"> EP-005 (Seguridad y Auditoría)</w:t>
+            </w:r>
+          </w:p>
+          <w:p>
+            <w:pPr>
+              <w:spacing w:after="240" w:before="240" w:lineRule="auto"/>
+              <w:rPr>
+                <w:rFonts w:ascii="Calibri" w:cs="Calibri" w:eastAsia="Calibri" w:hAnsi="Calibri"/>
+                <w:sz w:val="20"/>
+                <w:szCs w:val="20"/>
+              </w:rPr>
+            </w:pPr>
+            <w:r>
+              <w:rPr>
+                <w:rFonts w:ascii="Calibri" w:cs="Calibri" w:eastAsia="Calibri" w:hAnsi="Calibri"/>
+                <w:sz w:val="20"/>
+                <w:szCs w:val="20"/>
+                <w:rtl w:val="0"/>
+              </w:rPr>
+              <w:t xml:space="preserve">• </w:t>
+            </w:r>
+            <w:r>
+              <w:rPr>
+                <w:rFonts w:ascii="Calibri" w:cs="Calibri" w:eastAsia="Calibri" w:hAnsi="Calibri"/>
+                <w:b w:val="1"/>
+                <w:bCs w:val="1"/>
+                <w:sz w:val="20"/>
+                <w:szCs w:val="20"/>
+                <w:rtl w:val="0"/>
+              </w:rPr>
+              <w:t xml:space="preserve">Módulo:</w:t>
+            </w:r>
+            <w:r>
+              <w:rPr>
+                <w:rFonts w:ascii="Calibri" w:cs="Calibri" w:eastAsia="Calibri" w:hAnsi="Calibri"/>
+                <w:sz w:val="20"/>
+                <w:szCs w:val="20"/>
+                <w:rtl w:val="0"/>
+              </w:rPr>
+              <w:t xml:space="preserve"> Motor de Auditoría / Bitácoras</w:t>
+            </w:r>
+          </w:p>
+          <w:p>
+            <w:pPr>
+              <w:spacing w:after="240" w:before="240" w:lineRule="auto"/>
+              <w:rPr>
+                <w:rFonts w:ascii="Calibri" w:cs="Calibri" w:eastAsia="Calibri" w:hAnsi="Calibri"/>
+                <w:sz w:val="20"/>
+                <w:szCs w:val="20"/>
+              </w:rPr>
+            </w:pPr>
+            <w:r>
+              <w:rPr>
+                <w:rFonts w:ascii="Calibri" w:cs="Calibri" w:eastAsia="Calibri" w:hAnsi="Calibri"/>
+                <w:sz w:val="20"/>
+                <w:szCs w:val="20"/>
+                <w:rtl w:val="0"/>
+              </w:rPr>
+              <w:t xml:space="preserve">• </w:t>
+            </w:r>
+            <w:r>
+              <w:rPr>
+                <w:rFonts w:ascii="Calibri" w:cs="Calibri" w:eastAsia="Calibri" w:hAnsi="Calibri"/>
+                <w:b w:val="1"/>
+                <w:bCs w:val="1"/>
+                <w:sz w:val="20"/>
+                <w:szCs w:val="20"/>
+                <w:rtl w:val="0"/>
+              </w:rPr>
+              <w:t xml:space="preserve">Pruebas:</w:t>
+            </w:r>
+            <w:r>
+              <w:rPr>
+                <w:rFonts w:ascii="Calibri" w:cs="Calibri" w:eastAsia="Calibri" w:hAnsi="Calibri"/>
+                <w:sz w:val="20"/>
+                <w:szCs w:val="20"/>
+                <w:rtl w:val="0"/>
+              </w:rPr>
+              <w:t xml:space="preserve"> CP-RF016-01</w:t>
+            </w:r>
+          </w:p>
+        </w:tc>
+      </w:tr>
     </w:tbl>
     <w:p>
       <w:pPr>
@@ -8484,6 +9731,253 @@
               <w:rPr>
                 <w:rtl w:val="0"/>
               </w:rPr>
+            </w:r>
+          </w:p>
+        </w:tc>
+      </w:tr>
+      <w:tr>
+        <w:trPr>
+          <w:cantSplit w:val="0"/>
+          <w:tblHeader w:val="0"/>
+        </w:trPr>
+        <w:tc>
+          <w:tcPr>
+            <w:shd w:fill="1f497d" w:val="clear"/>
+            <w:tcMar>
+              <w:top w:w="80.0" w:type="dxa"/>
+              <w:left w:w="120.0" w:type="dxa"/>
+              <w:bottom w:w="80.0" w:type="dxa"/>
+              <w:right w:w="120.0" w:type="dxa"/>
+            </w:tcMar>
+          </w:tcPr>
+          <w:p>
+            <w:pPr>
+              <w:spacing w:after="0" w:lineRule="auto"/>
+              <w:rPr>
+                <w:rFonts w:ascii="Calibri" w:cs="Calibri" w:eastAsia="Calibri" w:hAnsi="Calibri"/>
+                <w:b w:val="1"/>
+                <w:bCs w:val="1"/>
+                <w:color w:val="ffffff"/>
+                <w:sz w:val="20"/>
+                <w:szCs w:val="20"/>
+              </w:rPr>
+            </w:pPr>
+            <w:r>
+              <w:rPr>
+                <w:rFonts w:ascii="Calibri" w:cs="Calibri" w:eastAsia="Calibri" w:hAnsi="Calibri"/>
+                <w:b w:val="1"/>
+                <w:bCs w:val="1"/>
+                <w:color w:val="ffffff"/>
+                <w:sz w:val="20"/>
+                <w:szCs w:val="20"/>
+                <w:rtl w:val="0"/>
+              </w:rPr>
+              <w:t xml:space="preserve">Trazabilidad</w:t>
+            </w:r>
+          </w:p>
+        </w:tc>
+        <w:tc>
+          <w:tcPr>
+            <w:tcMar>
+              <w:top w:w="80.0" w:type="dxa"/>
+              <w:left w:w="120.0" w:type="dxa"/>
+              <w:bottom w:w="80.0" w:type="dxa"/>
+              <w:right w:w="120.0" w:type="dxa"/>
+            </w:tcMar>
+          </w:tcPr>
+          <w:p>
+            <w:pPr>
+              <w:spacing w:after="240" w:before="240" w:lineRule="auto"/>
+              <w:rPr>
+                <w:rFonts w:ascii="Calibri" w:cs="Calibri" w:eastAsia="Calibri" w:hAnsi="Calibri"/>
+                <w:sz w:val="20"/>
+                <w:szCs w:val="20"/>
+              </w:rPr>
+            </w:pPr>
+            <w:r>
+              <w:rPr>
+                <w:rFonts w:ascii="Calibri" w:cs="Calibri" w:eastAsia="Calibri" w:hAnsi="Calibri"/>
+                <w:sz w:val="20"/>
+                <w:szCs w:val="20"/>
+                <w:rtl w:val="0"/>
+              </w:rPr>
+              <w:t xml:space="preserve">• </w:t>
+            </w:r>
+            <w:r>
+              <w:rPr>
+                <w:rFonts w:ascii="Calibri" w:cs="Calibri" w:eastAsia="Calibri" w:hAnsi="Calibri"/>
+                <w:b w:val="1"/>
+                <w:bCs w:val="1"/>
+                <w:sz w:val="20"/>
+                <w:szCs w:val="20"/>
+                <w:rtl w:val="0"/>
+              </w:rPr>
+              <w:t xml:space="preserve">Requerimiento Funcional:</w:t>
+            </w:r>
+            <w:r>
+              <w:rPr>
+                <w:rFonts w:ascii="Calibri" w:cs="Calibri" w:eastAsia="Calibri" w:hAnsi="Calibri"/>
+                <w:sz w:val="20"/>
+                <w:szCs w:val="20"/>
+                <w:rtl w:val="0"/>
+              </w:rPr>
+              <w:t xml:space="preserve"> RF017</w:t>
+            </w:r>
+          </w:p>
+          <w:p>
+            <w:pPr>
+              <w:spacing w:after="240" w:before="240" w:lineRule="auto"/>
+              <w:rPr>
+                <w:rFonts w:ascii="Calibri" w:cs="Calibri" w:eastAsia="Calibri" w:hAnsi="Calibri"/>
+                <w:sz w:val="20"/>
+                <w:szCs w:val="20"/>
+              </w:rPr>
+            </w:pPr>
+            <w:r>
+              <w:rPr>
+                <w:rFonts w:ascii="Calibri" w:cs="Calibri" w:eastAsia="Calibri" w:hAnsi="Calibri"/>
+                <w:sz w:val="20"/>
+                <w:szCs w:val="20"/>
+                <w:rtl w:val="0"/>
+              </w:rPr>
+              <w:t xml:space="preserve">• </w:t>
+            </w:r>
+            <w:r>
+              <w:rPr>
+                <w:rFonts w:ascii="Calibri" w:cs="Calibri" w:eastAsia="Calibri" w:hAnsi="Calibri"/>
+                <w:b w:val="1"/>
+                <w:bCs w:val="1"/>
+                <w:sz w:val="20"/>
+                <w:szCs w:val="20"/>
+                <w:rtl w:val="0"/>
+              </w:rPr>
+              <w:t xml:space="preserve">Historia de Usuario:</w:t>
+            </w:r>
+            <w:r>
+              <w:rPr>
+                <w:rFonts w:ascii="Calibri" w:cs="Calibri" w:eastAsia="Calibri" w:hAnsi="Calibri"/>
+                <w:sz w:val="20"/>
+                <w:szCs w:val="20"/>
+                <w:rtl w:val="0"/>
+              </w:rPr>
+              <w:t xml:space="preserve"> HU-017</w:t>
+            </w:r>
+          </w:p>
+          <w:p>
+            <w:pPr>
+              <w:spacing w:after="240" w:before="240" w:lineRule="auto"/>
+              <w:rPr>
+                <w:rFonts w:ascii="Calibri" w:cs="Calibri" w:eastAsia="Calibri" w:hAnsi="Calibri"/>
+                <w:sz w:val="20"/>
+                <w:szCs w:val="20"/>
+              </w:rPr>
+            </w:pPr>
+            <w:r>
+              <w:rPr>
+                <w:rFonts w:ascii="Calibri" w:cs="Calibri" w:eastAsia="Calibri" w:hAnsi="Calibri"/>
+                <w:sz w:val="20"/>
+                <w:szCs w:val="20"/>
+                <w:rtl w:val="0"/>
+              </w:rPr>
+              <w:t xml:space="preserve">• </w:t>
+            </w:r>
+            <w:r>
+              <w:rPr>
+                <w:rFonts w:ascii="Calibri" w:cs="Calibri" w:eastAsia="Calibri" w:hAnsi="Calibri"/>
+                <w:b w:val="1"/>
+                <w:bCs w:val="1"/>
+                <w:sz w:val="20"/>
+                <w:szCs w:val="20"/>
+                <w:rtl w:val="0"/>
+              </w:rPr>
+              <w:t xml:space="preserve">Épica:</w:t>
+            </w:r>
+            <w:r>
+              <w:rPr>
+                <w:rFonts w:ascii="Calibri" w:cs="Calibri" w:eastAsia="Calibri" w:hAnsi="Calibri"/>
+                <w:sz w:val="20"/>
+                <w:szCs w:val="20"/>
+                <w:rtl w:val="0"/>
+              </w:rPr>
+              <w:t xml:space="preserve"> EP-005 (Seguridad y Auditoría)</w:t>
+            </w:r>
+          </w:p>
+          <w:p>
+            <w:pPr>
+              <w:spacing w:after="240" w:before="240" w:lineRule="auto"/>
+              <w:rPr>
+                <w:rFonts w:ascii="Calibri" w:cs="Calibri" w:eastAsia="Calibri" w:hAnsi="Calibri"/>
+                <w:sz w:val="20"/>
+                <w:szCs w:val="20"/>
+              </w:rPr>
+            </w:pPr>
+            <w:r>
+              <w:rPr>
+                <w:rFonts w:ascii="Calibri" w:cs="Calibri" w:eastAsia="Calibri" w:hAnsi="Calibri"/>
+                <w:sz w:val="20"/>
+                <w:szCs w:val="20"/>
+                <w:rtl w:val="0"/>
+              </w:rPr>
+              <w:t xml:space="preserve">• </w:t>
+            </w:r>
+            <w:r>
+              <w:rPr>
+                <w:rFonts w:ascii="Calibri" w:cs="Calibri" w:eastAsia="Calibri" w:hAnsi="Calibri"/>
+                <w:b w:val="1"/>
+                <w:bCs w:val="1"/>
+                <w:sz w:val="20"/>
+                <w:szCs w:val="20"/>
+                <w:rtl w:val="0"/>
+              </w:rPr>
+              <w:t xml:space="preserve">Módulo:</w:t>
+            </w:r>
+            <w:r>
+              <w:rPr>
+                <w:rFonts w:ascii="Calibri" w:cs="Calibri" w:eastAsia="Calibri" w:hAnsi="Calibri"/>
+                <w:sz w:val="20"/>
+                <w:szCs w:val="20"/>
+                <w:rtl w:val="0"/>
+              </w:rPr>
+              <w:t xml:space="preserve"> Perfil de Usuario / Historial</w:t>
+            </w:r>
+          </w:p>
+          <w:p>
+            <w:pPr>
+              <w:spacing w:after="240" w:before="240" w:lineRule="auto"/>
+              <w:rPr>
+                <w:rFonts w:ascii="Calibri" w:cs="Calibri" w:eastAsia="Calibri" w:hAnsi="Calibri"/>
+                <w:sz w:val="20"/>
+                <w:szCs w:val="20"/>
+              </w:rPr>
+            </w:pPr>
+            <w:r>
+              <w:rPr>
+                <w:rFonts w:ascii="Calibri" w:cs="Calibri" w:eastAsia="Calibri" w:hAnsi="Calibri"/>
+                <w:sz w:val="20"/>
+                <w:szCs w:val="20"/>
+                <w:rtl w:val="0"/>
+              </w:rPr>
+              <w:t xml:space="preserve">• </w:t>
+            </w:r>
+            <w:r>
+              <w:rPr>
+                <w:rFonts w:ascii="Calibri" w:cs="Calibri" w:eastAsia="Calibri" w:hAnsi="Calibri"/>
+                <w:b w:val="1"/>
+                <w:bCs w:val="1"/>
+                <w:sz w:val="20"/>
+                <w:szCs w:val="20"/>
+                <w:rtl w:val="0"/>
+              </w:rPr>
+              <w:t xml:space="preserve">Pruebas:</w:t>
+            </w:r>
+            <w:r>
+              <w:rPr>
+                <w:rFonts w:ascii="Calibri" w:cs="Calibri" w:eastAsia="Calibri" w:hAnsi="Calibri"/>
+                <w:sz w:val="20"/>
+                <w:szCs w:val="20"/>
+                <w:rtl w:val="0"/>
+              </w:rPr>
+              <w:t xml:space="preserve"> CP-RF017-01</w:t>
             </w:r>
           </w:p>
         </w:tc>

</xml_diff>